<commit_message>
Remove unused custom payroll suite
</commit_message>
<xml_diff>
--- a/artifacts/dotbd_hr_custom_modules_lifecycle_sop.docx
+++ b/artifacts/dotbd_hr_custom_modules_lifecycle_sop.docx
@@ -1566,89 +1566,6 @@
                 <w:sz w:val="17"/>
               </w:rPr>
               <w:t>Managers, HR, attendance officer</w:t>
-            </w:r>
-          </w:p>
-        </w:tc>
-      </w:tr>
-      <w:tr>
-        <w:tc>
-          <w:tcPr>
-            <w:tcW w:type="dxa" w:w="2200"/>
-            <w:vAlign w:val="center"/>
-            <w:tcMar>
-              <w:top w:w="90" w:type="dxa"/>
-              <w:bottom w:w="90" w:type="dxa"/>
-              <w:start w:w="120" w:type="dxa"/>
-              <w:end w:w="120" w:type="dxa"/>
-            </w:tcMar>
-          </w:tcPr>
-          <w:p>
-            <w:pPr>
-              <w:spacing w:after="0"/>
-            </w:pPr>
-            <w:r>
-              <w:rPr>
-                <w:rFonts w:ascii="Calibri" w:hAnsi="Calibri"/>
-                <w:b w:val="0"/>
-                <w:i w:val="0"/>
-                <w:color w:val="000000"/>
-                <w:sz w:val="17"/>
-              </w:rPr>
-              <w:t>Payroll Suite</w:t>
-            </w:r>
-          </w:p>
-        </w:tc>
-        <w:tc>
-          <w:tcPr>
-            <w:tcW w:type="dxa" w:w="4800"/>
-            <w:vAlign w:val="center"/>
-            <w:tcMar>
-              <w:top w:w="90" w:type="dxa"/>
-              <w:bottom w:w="90" w:type="dxa"/>
-              <w:start w:w="120" w:type="dxa"/>
-              <w:end w:w="120" w:type="dxa"/>
-            </w:tcMar>
-          </w:tcPr>
-          <w:p>
-            <w:pPr>
-              <w:spacing w:after="0"/>
-            </w:pPr>
-            <w:r>
-              <w:rPr>
-                <w:rFonts w:ascii="Calibri" w:hAnsi="Calibri"/>
-                <w:b w:val="0"/>
-                <w:i w:val="0"/>
-                <w:color w:val="000000"/>
-                <w:sz w:val="17"/>
-              </w:rPr>
-              <w:t>Payroll profiles, allowances, PF/ESI flags, overtime input.</w:t>
-            </w:r>
-          </w:p>
-        </w:tc>
-        <w:tc>
-          <w:tcPr>
-            <w:tcW w:type="dxa" w:w="2360"/>
-            <w:vAlign w:val="center"/>
-            <w:tcMar>
-              <w:top w:w="90" w:type="dxa"/>
-              <w:bottom w:w="90" w:type="dxa"/>
-              <w:start w:w="120" w:type="dxa"/>
-              <w:end w:w="120" w:type="dxa"/>
-            </w:tcMar>
-          </w:tcPr>
-          <w:p>
-            <w:pPr>
-              <w:spacing w:after="0"/>
-            </w:pPr>
-            <w:r>
-              <w:rPr>
-                <w:rFonts w:ascii="Calibri" w:hAnsi="Calibri"/>
-                <w:b w:val="0"/>
-                <w:i w:val="0"/>
-                <w:color w:val="000000"/>
-                <w:sz w:val="17"/>
-              </w:rPr>
-              <w:t>Payroll, HR</w:t>
             </w:r>
           </w:p>
         </w:tc>
@@ -15953,7 +15870,7 @@
                 <w:color w:val="000000"/>
                 <w:sz w:val="17"/>
               </w:rPr>
-              <w:t>addons/dotbd_hr_payroll_suite and addons/hr_payroll_community</w:t>
+              <w:t>addons/hr_payroll_community and standard payroll configuration</w:t>
             </w:r>
           </w:p>
         </w:tc>

</xml_diff>